<commit_message>
docs: enrich section 3 overview with deep insights traversing level 1 to level 2 scenarios
</commit_message>
<xml_diff>
--- a/Section_3_应用现状_最终版.docx
+++ b/Section_3_应用现状_最终版.docx
@@ -20,82 +20,107 @@
     </w:p>
     <w:p>
       <w:r>
-        <w:t>当前人工智能在基础教育领域的应用已全面铺开，但不同场景的渗透深度呈现出高度不对称的结构性特征。基于收集的 1690 个典型案例，本报告将应用场景划分为“助学”、“助教”、“助评”、“助育”、“助管”与“助研”六大维度。通过对各维度案例体量的量化分析发现：</w:t>
+        <w:t>当前人工智能在基础教育领域的应用已全面铺开，但不同场景的渗透深度呈现出高度不对称的结构性特征。基于收集的 1690 个典型案例，本报告将应用场景划分为“助学”、“助教”、“助评”、“助育”、“助管”与“助研”六大一级维度，并在其下细分出多个二级应用场景。通过对一、二级场景分布体量的量化透视分析，可以发现：</w:t>
       </w:r>
       <w:r>
         <w:rPr>
           <w:b/>
         </w:rPr>
-        <w:t>AI 教育应用展现出极强的“助学主导”与“助教协同”特征，而面向管理、评价与教研的系统级应用仍处于初期探索阶段。</w:t>
+        <w:t>当前 AI 教育应用正处于“以大规模学习辅导为单核突破，以基于数据的教学分析为次级支撑，而评价、育人与教研体系仍处系统重构潜伏期”的非均衡发展阶段。</w:t>
       </w:r>
     </w:p>
     <w:p>
       <w:r>
-        <w:t>具体而言，</w:t>
+        <w:t>具体而言，从</w:t>
       </w:r>
       <w:r>
         <w:rPr>
           <w:b/>
         </w:rPr>
-        <w:t>“助学”场景</w:t>
+        <w:t>一级场景到二级场景的穿透洞察</w:t>
       </w:r>
       <w:r>
-        <w:t>以压倒性的 1215 个案例（占比 71.89%）占据绝对核心地位，其中以“智能辅导系统”（958例）和“情境式学习”（181例）为代表的直接面向学生个体的个性化学习支持已成为最成熟的应用赛道。其次为</w:t>
+        <w:t>揭示了以下核心趋势：</w:t>
       </w:r>
+    </w:p>
+    <w:p>
       <w:r>
         <w:rPr>
           <w:b/>
         </w:rPr>
-        <w:t>“助教”场景</w:t>
+        <w:t>第一，助学场景（71.89%）的“单核统治”与二级维度的“辅导压倒”效应。</w:t>
       </w:r>
       <w:r>
-        <w:t>（301例，占比 17.81%），AI 技术正快速向教师侧的“教学分析”（176例）与“备课/课件生成”（41例）环节渗透，助力教学质量的提升与教师减负。</w:t>
+        <w:t xml:space="preserve"> “助学”以 1215 个案例占据绝对核心。深入二级场景发现，超半数的总体案例资源（56.69%，958例）高度集中于“智能辅导系统”。这表明当前 AI 技术变现与落地的最大共识，依然是提供大规模、即时化、低成本的个性化练习与答疑（AI Tutor）。与之相对，“情境式学习”（10.71%，181例）作为第二大二级场景，预示着 AI 正通过多模态生成技术（图/视频）将单向的知识辅导引申向沉浸式的认知探索，但“游戏化学习”（1.12%）等重交互的形态构建依然寥寥无几。</w:t>
       </w:r>
     </w:p>
     <w:p>
       <w:r>
-        <w:t>相比之下，</w:t>
+        <w:rPr>
+          <w:b/>
+        </w:rPr>
+        <w:t>第二，助教场景（17.81%）的重心转移：从“资源生成”进化至“数据解析”。</w:t>
       </w:r>
+      <w:r>
+        <w:t xml:space="preserve"> 在 301 个助教案例中，二级场景的分布打破了常规认知。传统的“教师备课”（2.43%，41例）或课件生成并非主流，取而代之的是“教学分析”（10.41%，176例）的高频出现。这反映出教师对 AI 的核心诉求正在跨越“表层提效工具”（如一键生成教案），向“深层专业赋能”（如课堂互动图谱分析、作业数据挖掘）演进。但在“作业管理”（1.48%）和“课堂管理”（0.95%）等微观流程上，仍然受限于常态化采集设备的覆盖率。</w:t>
+      </w:r>
+    </w:p>
+    <w:p>
       <w:r>
         <w:rPr>
           <w:b/>
         </w:rPr>
-        <w:t>“助育”</w:t>
+        <w:t>第三，系统级长尾场景（占比不足10%）的“政策呼应”与“技术壁垒”。</w:t>
       </w:r>
       <w:r>
-        <w:t>（58例，3.43%）、</w:t>
+        <w:t xml:space="preserve"> “助评”（3.73%）、“助育”（3.43%）、“助管”（2.31%）与“助研”（0.47%）合计占比仍不及总数的一成，代表了 AI 赋能教育步入深水区所面临的复杂数据确权与伦理壁垒。即便在体量极小的长尾地带，二级场景的突围也极具指向性：</w:t>
       </w:r>
+    </w:p>
+    <w:p>
+      <w:pPr>
+        <w:pStyle w:val="ListBullet"/>
+      </w:pPr>
       <w:r>
         <w:rPr>
           <w:b/>
         </w:rPr>
-        <w:t>“助评”</w:t>
+        <w:t>在助评中，</w:t>
       </w:r>
       <w:r>
-        <w:t>（63例，3.73%）、</w:t>
+        <w:t>“综合素质评价”（2.66%，45例）一家独大，高度呼应了当前“破除唯分数论”与“五育并举”的教育评价改革刚需。</w:t>
       </w:r>
+    </w:p>
+    <w:p>
+      <w:pPr>
+        <w:pStyle w:val="ListBullet"/>
+      </w:pPr>
       <w:r>
         <w:rPr>
           <w:b/>
         </w:rPr>
-        <w:t>“助管”</w:t>
+        <w:t>在助育中，</w:t>
       </w:r>
       <w:r>
-        <w:t>（39例，2.31%）与</w:t>
+        <w:t>“智能心理支持”（1.83%，31例）占领高地，说明基于大规模语料的情感交互大模型，正在尝试填补校园心理师资供需失衡的巨大缺口。</w:t>
       </w:r>
+    </w:p>
+    <w:p>
+      <w:pPr>
+        <w:pStyle w:val="ListBullet"/>
+      </w:pPr>
       <w:r>
         <w:rPr>
           <w:b/>
         </w:rPr>
-        <w:t>“助研”</w:t>
+        <w:t>在助管与助研中，</w:t>
       </w:r>
       <w:r>
-        <w:t>（8例，0.47%）场景由于涉及更深层次的教育伦理、多维度数据打通及复杂的专业体系重构，应用规模普遍较小。在这些长尾场景中，“综合素质评价”（45例）与“智能心理支持”（31例）表现出一定的创新潜力，代表了未来 AI 赋能教育向深水区迈进与全人发展的战略方向。</w:t>
+        <w:t>前者主要依靠成熟机器视觉的“校园安全智能监控”（1.24%）维系，后者则完全处于破局前夜（仅 0.47%），凸显出底层教研模式亟待被大模型深度重构的现实迫切性。</w:t>
       </w:r>
     </w:p>
     <w:p>
       <w:r>
-        <w:t>为了更清晰地呈现各个应用维度的结构，下表总括了人工智能应用场景在基础教育中的分布矩阵：</w:t>
+        <w:t>为了更清晰地呈现各个应用维度的结构，下表总括了人工智能应用场景在基础教育中的一二级分布矩阵：</w:t>
       </w:r>
     </w:p>
     <w:tbl>

</xml_diff>